<commit_message>
Strip System Maintenance practical to two zero-skill activities
</commit_message>
<xml_diff>
--- a/01-system-maintenance/Practical_4_Handout.docx
+++ b/01-system-maintenance/Practical_4_Handout.docx
@@ -3,9 +3,6 @@
 <w:document xmlns:wpc="http://schemas.microsoft.com/office/word/2010/wordprocessingCanvas" xmlns:mo="http://schemas.microsoft.com/office/mac/office/2008/main" xmlns:mc="http://schemas.openxmlformats.org/markup-compatibility/2006" xmlns:mv="urn:schemas-microsoft-com:mac:vml" xmlns:o="urn:schemas-microsoft-com:office:office" xmlns:r="http://schemas.openxmlformats.org/officeDocument/2006/relationships" xmlns:m="http://schemas.openxmlformats.org/officeDocument/2006/math" xmlns:v="urn:schemas-microsoft-com:vml" xmlns:wp14="http://schemas.microsoft.com/office/word/2010/wordprocessingDrawing" xmlns:wp="http://schemas.openxmlformats.org/drawingml/2006/wordprocessingDrawing" xmlns:w10="urn:schemas-microsoft-com:office:word" xmlns:w="http://schemas.openxmlformats.org/wordprocessingml/2006/main" xmlns:w14="http://schemas.microsoft.com/office/word/2010/wordml" xmlns:wpg="http://schemas.microsoft.com/office/word/2010/wordprocessingGroup" xmlns:wpi="http://schemas.microsoft.com/office/word/2010/wordprocessingInk" xmlns:wne="http://schemas.microsoft.com/office/word/2006/wordml" xmlns:wps="http://schemas.microsoft.com/office/word/2010/wordprocessingShape" mc:Ignorable="w14 wp14">
   <w:body>
     <w:p>
-      <w:pPr>
-        <w:jc w:val="left"/>
-      </w:pPr>
       <w:r>
         <w:rPr>
           <w:b/>
@@ -16,16 +13,13 @@
       </w:r>
     </w:p>
     <w:p>
-      <w:pPr>
-        <w:jc w:val="left"/>
-      </w:pPr>
       <w:r>
         <w:rPr>
           <w:b/>
           <w:color w:val="1A1A1A"/>
           <w:sz w:val="44"/>
         </w:rPr>
-        <w:t>Log Analysis, Disk Space, Processes &amp; Alerts</w:t>
+        <w:t>Basic System Checks</w:t>
       </w:r>
     </w:p>
     <w:p>
@@ -46,7 +40,7 @@
           <w:i w:val="0"/>
           <w:sz w:val="22"/>
         </w:rPr>
-        <w:t>This handout is the hands-on companion to the System Maintenance Planning &amp; Troubleshooting session. It gives you practice with the everyday commands behind the five-step troubleshooting framework from the slides: Identify → Isolate → Fix → Verify → Log.</w:t>
+        <w:t>Two simple activities. No computer skills needed beyond reading a text file.</w:t>
       </w:r>
     </w:p>
     <w:p>
@@ -56,7 +50,7 @@
           <w:i w:val="0"/>
           <w:sz w:val="22"/>
         </w:rPr>
-        <w:t>Work in your country team. Where a command is Linux-specific, a Windows equivalent is given alongside it - use whichever matches your own systems.</w:t>
+        <w:t>Work in your country team.</w:t>
       </w:r>
     </w:p>
     <w:p>
@@ -74,7 +68,7 @@
         <w:pStyle w:val="ListBullet"/>
       </w:pPr>
       <w:r>
-        <w:t>A terminal (Linux/Mac) or PowerShell (Windows)</w:t>
+        <w:t>sample_system_log.txt (in this folder) - open it in Notepad or any text editor</w:t>
       </w:r>
     </w:p>
     <w:p>
@@ -82,23 +76,7 @@
         <w:pStyle w:val="ListBullet"/>
       </w:pPr>
       <w:r>
-        <w:t>The sample log file: sample_syslog.log (in this folder)</w:t>
-      </w:r>
-    </w:p>
-    <w:p>
-      <w:pPr>
-        <w:pStyle w:val="ListBullet"/>
-      </w:pPr>
-      <w:r>
-        <w:t>The two example scripts: check_disk_alert.sh and check_service_alert.sh (in this folder)</w:t>
-      </w:r>
-    </w:p>
-    <w:p>
-      <w:pPr>
-        <w:pStyle w:val="ListBullet"/>
-      </w:pPr>
-      <w:r>
-        <w:t>The commands_cheatsheet.md file - keep it open for reference throughout</w:t>
+        <w:t>Pen and paper, or type into this document</w:t>
       </w:r>
     </w:p>
     <w:p>
@@ -113,7 +91,7 @@
           <w:color w:val="02C39A"/>
           <w:sz w:val="30"/>
         </w:rPr>
-        <w:t>Part A - Checking Disk Space  (10 min)</w:t>
+        <w:t>Activity 1 — Read a Simple Log</w:t>
       </w:r>
     </w:p>
     <w:p>
@@ -123,7 +101,7 @@
           <w:i w:val="0"/>
           <w:sz w:val="22"/>
         </w:rPr>
-        <w:t>A full disk is one of the most common causes of an NMHS website or service going down.</w:t>
+        <w:t>A log is just a record of what happened, in order. Open sample_system_log.txt and read it from top to bottom, like a short story.</w:t>
       </w:r>
     </w:p>
     <w:p>
@@ -131,20 +109,7 @@
         <w:pStyle w:val="ListNumber"/>
       </w:pPr>
       <w:r>
-        <w:t>Run df -h and look at the output. What does each column mean (Filesystem, Size, Used, Avail, Use%, Mounted on)?</w:t>
-      </w:r>
-    </w:p>
-    <w:p>
-      <w:pPr>
-        <w:ind w:left="432"/>
-      </w:pPr>
-      <w:r>
-        <w:rPr>
-          <w:rFonts w:ascii="Consolas" w:hAnsi="Consolas"/>
-          <w:color w:val="02664D"/>
-          <w:sz w:val="21"/>
-        </w:rPr>
-        <w:t>df -h</w:t>
+        <w:t>Everything marked OK is normal - nothing to worry about.</w:t>
       </w:r>
     </w:p>
     <w:p>
@@ -152,7 +117,7 @@
         <w:pStyle w:val="ListNumber"/>
       </w:pPr>
       <w:r>
-        <w:t>Which partition is closest to being full?</w:t>
+        <w:t>Find where WARNING first appears. What was starting to go wrong?</w:t>
       </w:r>
     </w:p>
     <w:p>
@@ -160,20 +125,7 @@
         <w:pStyle w:val="ListNumber"/>
       </w:pPr>
       <w:r>
-        <w:t>Find out what is using the most space in a folder:</w:t>
-      </w:r>
-    </w:p>
-    <w:p>
-      <w:pPr>
-        <w:ind w:left="432"/>
-      </w:pPr>
-      <w:r>
-        <w:rPr>
-          <w:rFonts w:ascii="Consolas" w:hAnsi="Consolas"/>
-          <w:color w:val="02664D"/>
-          <w:sz w:val="21"/>
-        </w:rPr>
-        <w:t>du -sh /var/log/*</w:t>
+        <w:t>Find where ERROR appears. What actually broke?</w:t>
       </w:r>
     </w:p>
     <w:p>
@@ -181,17 +133,15 @@
         <w:pStyle w:val="ListNumber"/>
       </w:pPr>
       <w:r>
-        <w:t>Discuss as a team: what's a sensible warning threshold? (Most teams use 80% as a warning and 90%+ as urgent.)</w:t>
+        <w:t>Find where FIXED appears. What fixed it?</w:t>
       </w:r>
     </w:p>
     <w:p>
+      <w:pPr>
+        <w:pStyle w:val="ListNumber"/>
+      </w:pPr>
       <w:r>
-        <w:rPr>
-          <w:b w:val="0"/>
-          <w:i/>
-          <w:sz w:val="22"/>
-        </w:rPr>
-        <w:t>Windows equivalent: Get-PSDrive -PSProvider FileSystem, or check drive properties in File Explorer.</w:t>
+        <w:t>Talk as a team: if someone had noticed the WARNING earlier, could this have been avoided?</w:t>
       </w:r>
     </w:p>
     <w:p>
@@ -206,7 +156,7 @@
           <w:color w:val="02C39A"/>
           <w:sz w:val="30"/>
         </w:rPr>
-        <w:t>Part B - Checking Running Processes  (10 min)</w:t>
+        <w:t>Activity 2 — Make a Simple Plan</w:t>
       </w:r>
     </w:p>
     <w:p>
@@ -216,88 +166,153 @@
           <w:i w:val="0"/>
           <w:sz w:val="22"/>
         </w:rPr>
-        <w:t>When a service is slow or unresponsive, the next question is usually: what is actually running, and is something using too much CPU or memory?</w:t>
+        <w:t>No computer needed for this part - just agree on a simple plan as a team, and write it down.</w:t>
       </w:r>
     </w:p>
-    <w:p>
-      <w:pPr>
-        <w:pStyle w:val="ListNumber"/>
-      </w:pPr>
-      <w:r>
-        <w:t>List all running processes:</w:t>
-      </w:r>
-    </w:p>
-    <w:p>
-      <w:pPr>
-        <w:ind w:left="432"/>
-      </w:pPr>
-      <w:r>
-        <w:rPr>
-          <w:rFonts w:ascii="Consolas" w:hAnsi="Consolas"/>
-          <w:color w:val="02664D"/>
-          <w:sz w:val="21"/>
-        </w:rPr>
-        <w:t>ps aux</w:t>
-      </w:r>
-    </w:p>
-    <w:p>
-      <w:pPr>
-        <w:pStyle w:val="ListNumber"/>
-      </w:pPr>
-      <w:r>
-        <w:t>Or watch them live, updating automatically:</w:t>
-      </w:r>
-    </w:p>
-    <w:p>
-      <w:pPr>
-        <w:ind w:left="432"/>
-      </w:pPr>
-      <w:r>
-        <w:rPr>
-          <w:rFonts w:ascii="Consolas" w:hAnsi="Consolas"/>
-          <w:color w:val="02664D"/>
-          <w:sz w:val="21"/>
-        </w:rPr>
-        <w:t>top</w:t>
-      </w:r>
-    </w:p>
-    <w:p>
-      <w:pPr>
-        <w:pStyle w:val="ListNumber"/>
-      </w:pPr>
-      <w:r>
-        <w:t>Find the process ID (PID) of a specific service, e.g. nginx:</w:t>
-      </w:r>
-    </w:p>
-    <w:p>
-      <w:pPr>
-        <w:ind w:left="432"/>
-      </w:pPr>
-      <w:r>
-        <w:rPr>
-          <w:rFonts w:ascii="Consolas" w:hAnsi="Consolas"/>
-          <w:color w:val="02664D"/>
-          <w:sz w:val="21"/>
-        </w:rPr>
-        <w:t>pgrep nginx</w:t>
-      </w:r>
-    </w:p>
-    <w:p>
-      <w:pPr>
-        <w:pStyle w:val="ListNumber"/>
-      </w:pPr>
-      <w:r>
-        <w:t>Discuss: when is it safe to stop a process yourself (kill &lt;PID&gt;), and when should you escalate instead (using the escalation pathway from the main session)?</w:t>
-      </w:r>
-    </w:p>
+    <w:tbl>
+      <w:tblPr>
+        <w:tblStyle w:val="LightGrid-Accent1"/>
+        <w:tblW w:type="auto" w:w="0"/>
+        <w:tblLook w:firstColumn="1" w:firstRow="1" w:lastColumn="0" w:lastRow="0" w:noHBand="0" w:noVBand="1" w:val="04A0"/>
+      </w:tblPr>
+      <w:tblGrid>
+        <w:gridCol w:w="2880"/>
+        <w:gridCol w:w="2880"/>
+        <w:gridCol w:w="2880"/>
+      </w:tblGrid>
+      <w:tr>
+        <w:tc>
+          <w:tcPr>
+            <w:tcW w:type="dxa" w:w="2880"/>
+          </w:tcPr>
+          <w:p>
+            <w:r>
+              <w:rPr>
+                <w:b/>
+              </w:rPr>
+              <w:t>What to check</w:t>
+            </w:r>
+          </w:p>
+        </w:tc>
+        <w:tc>
+          <w:tcPr>
+            <w:tcW w:type="dxa" w:w="2880"/>
+          </w:tcPr>
+          <w:p>
+            <w:r>
+              <w:rPr>
+                <w:b/>
+              </w:rPr>
+              <w:t>Who checks it</w:t>
+            </w:r>
+          </w:p>
+        </w:tc>
+        <w:tc>
+          <w:tcPr>
+            <w:tcW w:type="dxa" w:w="2880"/>
+          </w:tcPr>
+          <w:p>
+            <w:r>
+              <w:rPr>
+                <w:b/>
+              </w:rPr>
+              <w:t>How do they tell someone if there’s a problem</w:t>
+            </w:r>
+          </w:p>
+        </w:tc>
+      </w:tr>
+      <w:tr>
+        <w:tc>
+          <w:tcPr>
+            <w:tcW w:type="dxa" w:w="2880"/>
+          </w:tcPr>
+          <w:p>
+            <w:r>
+              <w:t>Is the website working?</w:t>
+            </w:r>
+          </w:p>
+        </w:tc>
+        <w:tc>
+          <w:tcPr>
+            <w:tcW w:type="dxa" w:w="2880"/>
+          </w:tcPr>
+          <w:p>
+            <w:r/>
+          </w:p>
+        </w:tc>
+        <w:tc>
+          <w:tcPr>
+            <w:tcW w:type="dxa" w:w="2880"/>
+          </w:tcPr>
+          <w:p>
+            <w:r/>
+          </w:p>
+        </w:tc>
+      </w:tr>
+      <w:tr>
+        <w:tc>
+          <w:tcPr>
+            <w:tcW w:type="dxa" w:w="2880"/>
+          </w:tcPr>
+          <w:p>
+            <w:r>
+              <w:t>Did the backup run?</w:t>
+            </w:r>
+          </w:p>
+        </w:tc>
+        <w:tc>
+          <w:tcPr>
+            <w:tcW w:type="dxa" w:w="2880"/>
+          </w:tcPr>
+          <w:p>
+            <w:r/>
+          </w:p>
+        </w:tc>
+        <w:tc>
+          <w:tcPr>
+            <w:tcW w:type="dxa" w:w="2880"/>
+          </w:tcPr>
+          <w:p>
+            <w:r/>
+          </w:p>
+        </w:tc>
+      </w:tr>
+      <w:tr>
+        <w:tc>
+          <w:tcPr>
+            <w:tcW w:type="dxa" w:w="2880"/>
+          </w:tcPr>
+          <w:p>
+            <w:r/>
+          </w:p>
+        </w:tc>
+        <w:tc>
+          <w:tcPr>
+            <w:tcW w:type="dxa" w:w="2880"/>
+          </w:tcPr>
+          <w:p>
+            <w:r/>
+          </w:p>
+        </w:tc>
+        <w:tc>
+          <w:tcPr>
+            <w:tcW w:type="dxa" w:w="2880"/>
+          </w:tcPr>
+          <w:p>
+            <w:r/>
+          </w:p>
+        </w:tc>
+      </w:tr>
+    </w:tbl>
+    <w:p/>
     <w:p>
       <w:r>
         <w:rPr>
           <w:b w:val="0"/>
-          <w:i/>
+          <w:i w:val="0"/>
           <w:sz w:val="22"/>
         </w:rPr>
-        <w:t>Windows equivalent: Task Manager, or Get-Process / Stop-Process in PowerShell.</w:t>
+        <w:t>There is no wrong answer - a phone call, a message, or telling someone in person are all fine. The important thing is that everyone agrees on the plan before something breaks.</w:t>
       </w:r>
     </w:p>
     <w:p>
@@ -312,245 +327,7 @@
           <w:color w:val="02C39A"/>
           <w:sz w:val="30"/>
         </w:rPr>
-        <w:t>Part C - Reading &amp; Searching Log Files  (15 min)</w:t>
-      </w:r>
-    </w:p>
-    <w:p>
-      <w:r>
-        <w:rPr>
-          <w:b w:val="0"/>
-          <w:i w:val="0"/>
-          <w:sz w:val="22"/>
-        </w:rPr>
-        <w:t>Open sample_syslog.log - it is a real (simulated) day in the life of an NMHS web server, including an incident. Work through the questions below as a team.</w:t>
-      </w:r>
-    </w:p>
-    <w:p>
-      <w:pPr>
-        <w:pStyle w:val="ListNumber"/>
-      </w:pPr>
-      <w:r>
-        <w:t>Look at the first few lines to get oriented:</w:t>
-      </w:r>
-    </w:p>
-    <w:p>
-      <w:pPr>
-        <w:ind w:left="432"/>
-      </w:pPr>
-      <w:r>
-        <w:rPr>
-          <w:rFonts w:ascii="Consolas" w:hAnsi="Consolas"/>
-          <w:color w:val="02664D"/>
-          <w:sz w:val="21"/>
-        </w:rPr>
-        <w:t>head -n 10 sample_syslog.log</w:t>
-      </w:r>
-    </w:p>
-    <w:p>
-      <w:pPr>
-        <w:pStyle w:val="ListNumber"/>
-      </w:pPr>
-      <w:r>
-        <w:t>Search for every ERROR line:</w:t>
-      </w:r>
-    </w:p>
-    <w:p>
-      <w:pPr>
-        <w:ind w:left="432"/>
-      </w:pPr>
-      <w:r>
-        <w:rPr>
-          <w:rFonts w:ascii="Consolas" w:hAnsi="Consolas"/>
-          <w:color w:val="02664D"/>
-          <w:sz w:val="21"/>
-        </w:rPr>
-        <w:t>grep ERROR sample_syslog.log</w:t>
-      </w:r>
-    </w:p>
-    <w:p>
-      <w:pPr>
-        <w:pStyle w:val="ListNumber"/>
-      </w:pPr>
-      <w:r>
-        <w:t>Search for every WARN line and count them:</w:t>
-      </w:r>
-    </w:p>
-    <w:p>
-      <w:pPr>
-        <w:ind w:left="432"/>
-      </w:pPr>
-      <w:r>
-        <w:rPr>
-          <w:rFonts w:ascii="Consolas" w:hAnsi="Consolas"/>
-          <w:color w:val="02664D"/>
-          <w:sz w:val="21"/>
-        </w:rPr>
-        <w:t>grep -c WARN sample_syslog.log</w:t>
-      </w:r>
-    </w:p>
-    <w:p>
-      <w:pPr>
-        <w:pStyle w:val="ListNumber"/>
-      </w:pPr>
-      <w:r>
-        <w:t>Find the moment things went wrong. What time does the first ERROR appear, and what do the WARN lines right before it tell you?</w:t>
-      </w:r>
-    </w:p>
-    <w:p>
-      <w:pPr>
-        <w:pStyle w:val="ListNumber"/>
-      </w:pPr>
-      <w:r>
-        <w:t>As a team, answer: what was the root cause of the incident in this log, and what was the fix? What would you write in the incident log for this?</w:t>
-      </w:r>
-    </w:p>
-    <w:p>
-      <w:r>
-        <w:rPr>
-          <w:b w:val="0"/>
-          <w:i/>
-          <w:sz w:val="22"/>
-        </w:rPr>
-        <w:t>Windows equivalent: Select-String ERROR sample_syslog.log in PowerShell, or Event Viewer for real Windows server logs.</w:t>
-      </w:r>
-    </w:p>
-    <w:p>
-      <w:r>
-        <w:t>______________________________________________________________________</w:t>
-      </w:r>
-    </w:p>
-    <w:p>
-      <w:r>
-        <w:rPr>
-          <w:b/>
-          <w:color w:val="02C39A"/>
-          <w:sz w:val="30"/>
-        </w:rPr>
-        <w:t>Part D - Setting Up a Simple Alert  (10 min)</w:t>
-      </w:r>
-    </w:p>
-    <w:p>
-      <w:r>
-        <w:rPr>
-          <w:b w:val="0"/>
-          <w:i w:val="0"/>
-          <w:sz w:val="22"/>
-        </w:rPr>
-        <w:t>The goal here is not a perfect monitoring system - it is a first, working alert you could realistically run at your own NMHS.</w:t>
-      </w:r>
-    </w:p>
-    <w:p>
-      <w:pPr>
-        <w:pStyle w:val="ListNumber"/>
-      </w:pPr>
-      <w:r>
-        <w:t>Open check_disk_alert.sh and read through the comments as a team.</w:t>
-      </w:r>
-    </w:p>
-    <w:p>
-      <w:pPr>
-        <w:pStyle w:val="ListNumber"/>
-      </w:pPr>
-      <w:r>
-        <w:t>Run it once by hand:</w:t>
-      </w:r>
-    </w:p>
-    <w:p>
-      <w:pPr>
-        <w:ind w:left="432"/>
-      </w:pPr>
-      <w:r>
-        <w:rPr>
-          <w:rFonts w:ascii="Consolas" w:hAnsi="Consolas"/>
-          <w:color w:val="02664D"/>
-          <w:sz w:val="21"/>
-        </w:rPr>
-        <w:t>bash check_disk_alert.sh</w:t>
-      </w:r>
-    </w:p>
-    <w:p>
-      <w:r>
-        <w:rPr>
-          <w:b w:val="0"/>
-          <w:i w:val="0"/>
-          <w:sz w:val="22"/>
-        </w:rPr>
-        <w:t>Check that a new alert.log file appeared in the folder - open it and see what got logged.</w:t>
-      </w:r>
-    </w:p>
-    <w:p>
-      <w:pPr>
-        <w:pStyle w:val="ListNumber"/>
-      </w:pPr>
-      <w:r>
-        <w:t>Discuss: how would you make this run automatically, without anyone remembering to do it? Introduce cron:</w:t>
-      </w:r>
-    </w:p>
-    <w:p>
-      <w:pPr>
-        <w:ind w:left="432"/>
-      </w:pPr>
-      <w:r>
-        <w:rPr>
-          <w:rFonts w:ascii="Consolas" w:hAnsi="Consolas"/>
-          <w:color w:val="02664D"/>
-          <w:sz w:val="21"/>
-        </w:rPr>
-        <w:t>crontab -e</w:t>
-      </w:r>
-    </w:p>
-    <w:p>
-      <w:r>
-        <w:rPr>
-          <w:b w:val="0"/>
-          <w:i w:val="0"/>
-          <w:sz w:val="22"/>
-        </w:rPr>
-        <w:t>Then a line like this schedules it to run every hour:</w:t>
-      </w:r>
-    </w:p>
-    <w:p>
-      <w:pPr>
-        <w:ind w:left="432"/>
-      </w:pPr>
-      <w:r>
-        <w:rPr>
-          <w:rFonts w:ascii="Consolas" w:hAnsi="Consolas"/>
-          <w:color w:val="02664D"/>
-          <w:sz w:val="21"/>
-        </w:rPr>
-        <w:t>0 * * * * /path/to/check_disk_alert.sh</w:t>
-      </w:r>
-    </w:p>
-    <w:p>
-      <w:pPr>
-        <w:pStyle w:val="ListNumber"/>
-      </w:pPr>
-      <w:r>
-        <w:t>Now open check_service_alert.sh - same idea, but it checks whether a named service (e.g. nginx) is still running, instead of checking disk space.</w:t>
-      </w:r>
-    </w:p>
-    <w:p>
-      <w:pPr>
-        <w:pStyle w:val="ListNumber"/>
-      </w:pPr>
-      <w:r>
-        <w:t>Discuss as a team: what would 'an alert' realistically mean for your NMHS - email, SMS, a shared chat channel, or simply a log file someone checks each morning? There is no wrong answer here - pick what is realistic for your team’s resources today, and you can always improve it later.</w:t>
-      </w:r>
-    </w:p>
-    <w:p>
-      <w:r>
-        <w:t>______________________________________________________________________</w:t>
-      </w:r>
-    </w:p>
-    <w:p>
-      <w:r>
-        <w:rPr>
-          <w:b/>
-          <w:color w:val="02C39A"/>
-          <w:sz w:val="30"/>
-        </w:rPr>
-        <w:t>Wrap-Up  (5 min)</w:t>
+        <w:t>Wrap-Up</w:t>
       </w:r>
     </w:p>
     <w:p>
@@ -558,7 +335,7 @@
         <w:pStyle w:val="ListBullet"/>
       </w:pPr>
       <w:r>
-        <w:t>Add "check disk space, processes and logs" as a recurring line on the maintenance calendar you drafted in the main session.</w:t>
+        <w:t>Keep this plan somewhere the whole team can see it.</w:t>
       </w:r>
     </w:p>
     <w:p>
@@ -566,15 +343,7 @@
         <w:pStyle w:val="ListBullet"/>
       </w:pPr>
       <w:r>
-        <w:t>Log today’s practical run in your incident log - even a training run is good practice for the habit.</w:t>
-      </w:r>
-    </w:p>
-    <w:p>
-      <w:pPr>
-        <w:pStyle w:val="ListBullet"/>
-      </w:pPr>
-      <w:r>
-        <w:t>Take the two example scripts and the cheat sheet home - they are ready to adapt to your own server.</w:t>
+        <w:t>Reading a log calmly, like in Activity 1, makes it much easier when it’s a real problem.</w:t>
       </w:r>
     </w:p>
     <w:p/>

</xml_diff>

<commit_message>
Add optional Codespace-only disk/process check to System Maintenance practical
</commit_message>
<xml_diff>
--- a/01-system-maintenance/Practical_4_Handout.docx
+++ b/01-system-maintenance/Practical_4_Handout.docx
@@ -313,6 +313,73 @@
           <w:sz w:val="22"/>
         </w:rPr>
         <w:t>There is no wrong answer - a phone call, a message, or telling someone in person are all fine. The important thing is that everyone agrees on the plan before something breaks.</w:t>
+      </w:r>
+    </w:p>
+    <w:p>
+      <w:r>
+        <w:t>______________________________________________________________________</w:t>
+      </w:r>
+    </w:p>
+    <w:p>
+      <w:r>
+        <w:rPr>
+          <w:b/>
+          <w:color w:val="02C39A"/>
+          <w:sz w:val="30"/>
+        </w:rPr>
+        <w:t>Optional Extra — Only If You’re Using a Codespace</w:t>
+      </w:r>
+    </w:p>
+    <w:p>
+      <w:r>
+        <w:rPr>
+          <w:b w:val="0"/>
+          <w:i w:val="0"/>
+          <w:sz w:val="22"/>
+        </w:rPr>
+        <w:t>Skip this section completely if you’re not using a Codespace for this workshop - the two activities above are the whole practical. If you are in a Codespace, you have a real terminal available, so here are two optional look-only checks. Nothing to fix, nothing to change.</w:t>
+      </w:r>
+    </w:p>
+    <w:p>
+      <w:pPr>
+        <w:pStyle w:val="ListNumber"/>
+      </w:pPr>
+      <w:r>
+        <w:t>Check disk space - type this and press Enter, then look at how full the disk is:</w:t>
+      </w:r>
+    </w:p>
+    <w:p>
+      <w:pPr>
+        <w:ind w:left="432"/>
+      </w:pPr>
+      <w:r>
+        <w:rPr>
+          <w:rFonts w:ascii="Consolas" w:hAnsi="Consolas"/>
+          <w:color w:val="02664D"/>
+          <w:sz w:val="21"/>
+        </w:rPr>
+        <w:t>df -h</w:t>
+      </w:r>
+    </w:p>
+    <w:p>
+      <w:pPr>
+        <w:pStyle w:val="ListNumber"/>
+      </w:pPr>
+      <w:r>
+        <w:t>Check what’s running - type this and press Enter (press q to quit). Each line is a running program:</w:t>
+      </w:r>
+    </w:p>
+    <w:p>
+      <w:pPr>
+        <w:ind w:left="432"/>
+      </w:pPr>
+      <w:r>
+        <w:rPr>
+          <w:rFonts w:ascii="Consolas" w:hAnsi="Consolas"/>
+          <w:color w:val="02664D"/>
+          <w:sz w:val="21"/>
+        </w:rPr>
+        <w:t>top</w:t>
       </w:r>
     </w:p>
     <w:p>

</xml_diff>